<commit_message>
se modifica el archivo de jabalina en la luna
</commit_message>
<xml_diff>
--- a/Lunar_Javelin_Tournament.docx
+++ b/Lunar_Javelin_Tournament.docx
@@ -31,6 +31,21 @@
         <w:br/>
         <w:t xml:space="preserve">JABALINA EN LA LUNA </w:t>
       </w:r>
+    </w:p>
+    <w:p>
+      <w:pPr>
+        <w:rPr>
+          <w:rFonts w:ascii="Arial" w:hAnsi="Arial" w:cs="Arial"/>
+          <w:lang w:val="es-CO"/>
+        </w:rPr>
+      </w:pPr>
+      <w:r>
+        <w:rPr>
+          <w:rFonts w:ascii="Arial" w:hAnsi="Arial" w:cs="Arial"/>
+          <w:lang w:val="es-CO"/>
+        </w:rPr>
+        <w:t>Docente Augusto Salazar</w:t>
+      </w:r>
       <w:r>
         <w:rPr>
           <w:rFonts w:ascii="Arial" w:hAnsi="Arial" w:cs="Arial"/>
@@ -51,7 +66,7 @@
           <w:rFonts w:ascii="Arial" w:hAnsi="Arial" w:cs="Arial"/>
           <w:lang w:val="es-CO"/>
         </w:rPr>
-        <w:t xml:space="preserve">BERNARDO PATIÑO ARROYAVE </w:t>
+        <w:t xml:space="preserve">Estudiante: Bernardo Patiño </w:t>
       </w:r>
     </w:p>
     <w:p>
@@ -288,16 +303,9 @@
           <w:rFonts w:ascii="Arial" w:hAnsi="Arial" w:cs="Arial"/>
           <w:lang w:val="es-CO"/>
         </w:rPr>
+        <w:lastRenderedPageBreak/>
         <w:br/>
-        <w:t xml:space="preserve">El personaje se ubica en el centro y puede lanzar jabalinas en distintas direcciones para </w:t>
-      </w:r>
-      <w:r>
-        <w:rPr>
-          <w:rFonts w:ascii="Arial" w:hAnsi="Arial" w:cs="Arial"/>
-          <w:lang w:val="es-CO"/>
-        </w:rPr>
-        <w:lastRenderedPageBreak/>
-        <w:t>destruir los meteoritos antes de que lo golpeen.</w:t>
+        <w:t>El personaje se ubica en el centro y puede lanzar jabalinas en distintas direcciones para destruir los meteoritos antes de que lo golpeen.</w:t>
       </w:r>
       <w:r>
         <w:rPr>

</xml_diff>